<commit_message>
Update SQL solutions and test documentation
</commit_message>
<xml_diff>
--- a/docs/Отчет.docx
+++ b/docs/Отчет.docx
@@ -53,7 +53,7 @@
           <w:sz w:val="28"/>
           <w:szCs w:val="28"/>
         </w:rPr>
-        <w:t>Теория, необходимая для изучения перед интервью с руководителем.</w:t>
+        <w:t>Теория</w:t>
       </w:r>
     </w:p>
     <w:p>
@@ -506,7 +506,6 @@
           <w:sz w:val="28"/>
           <w:szCs w:val="28"/>
         </w:rPr>
-        <w:lastRenderedPageBreak/>
         <w:t>5. Какие бывают типы связей? Как реализовать «многие ко многим»?</w:t>
       </w:r>
     </w:p>
@@ -528,6 +527,7 @@
           <w:sz w:val="28"/>
           <w:szCs w:val="28"/>
         </w:rPr>
+        <w:lastRenderedPageBreak/>
         <w:t>Один к одному (1:1): одна запись связана максимум с одной записью.</w:t>
       </w:r>
     </w:p>
@@ -1182,7 +1182,6 @@
           <w:sz w:val="28"/>
           <w:szCs w:val="28"/>
         </w:rPr>
-        <w:lastRenderedPageBreak/>
         <w:t>INNER JOIN: только совпавшие строки.</w:t>
       </w:r>
     </w:p>
@@ -1204,6 +1203,7 @@
           <w:sz w:val="28"/>
           <w:szCs w:val="28"/>
         </w:rPr>
+        <w:lastRenderedPageBreak/>
         <w:t>LEFT JOIN: все строки слева и совпадения справа; иначе справа NULL.</w:t>
       </w:r>
     </w:p>
@@ -1714,18 +1714,30 @@
         <w:jc w:val="center"/>
         <w:rPr>
           <w:rFonts w:ascii="Times New Roman" w:hAnsi="Times New Roman" w:cs="Times New Roman"/>
-          <w:sz w:val="28"/>
-          <w:szCs w:val="28"/>
-        </w:rPr>
-      </w:pPr>
-      <w:r>
-        <w:rPr>
-          <w:rFonts w:ascii="Times New Roman" w:hAnsi="Times New Roman" w:cs="Times New Roman"/>
           <w:b/>
           <w:bCs/>
           <w:sz w:val="28"/>
           <w:szCs w:val="28"/>
         </w:rPr>
+      </w:pPr>
+    </w:p>
+    <w:p>
+      <w:pPr>
+        <w:jc w:val="center"/>
+        <w:rPr>
+          <w:rFonts w:ascii="Times New Roman" w:hAnsi="Times New Roman" w:cs="Times New Roman"/>
+          <w:sz w:val="28"/>
+          <w:szCs w:val="28"/>
+        </w:rPr>
+      </w:pPr>
+      <w:r>
+        <w:rPr>
+          <w:rFonts w:ascii="Times New Roman" w:hAnsi="Times New Roman" w:cs="Times New Roman"/>
+          <w:b/>
+          <w:bCs/>
+          <w:sz w:val="28"/>
+          <w:szCs w:val="28"/>
+        </w:rPr>
         <w:lastRenderedPageBreak/>
         <w:t xml:space="preserve">Часть </w:t>
       </w:r>
@@ -3904,7 +3916,6 @@
           <w:rFonts w:ascii="Times New Roman" w:hAnsi="Times New Roman" w:cs="Times New Roman"/>
           <w:sz w:val="28"/>
           <w:szCs w:val="28"/>
-          <w:lang w:val="en-US"/>
         </w:rPr>
       </w:pPr>
       <w:r>
@@ -4735,9 +4746,1561 @@
     </w:p>
     <w:p>
       <w:pPr>
+        <w:rPr>
+          <w:rFonts w:ascii="Times New Roman" w:hAnsi="Times New Roman" w:cs="Times New Roman"/>
+          <w:sz w:val="28"/>
+          <w:szCs w:val="28"/>
+        </w:rPr>
+      </w:pPr>
+    </w:p>
+    <w:p>
+      <w:pPr>
+        <w:jc w:val="center"/>
+        <w:rPr>
+          <w:rFonts w:ascii="Times New Roman" w:hAnsi="Times New Roman" w:cs="Times New Roman"/>
+          <w:sz w:val="28"/>
+          <w:szCs w:val="28"/>
+        </w:rPr>
+      </w:pPr>
+      <w:r>
+        <w:rPr>
+          <w:rFonts w:ascii="Times New Roman" w:hAnsi="Times New Roman" w:cs="Times New Roman"/>
+          <w:b/>
+          <w:bCs/>
+          <w:sz w:val="28"/>
+          <w:szCs w:val="28"/>
+        </w:rPr>
+        <w:t xml:space="preserve">Часть 3. Python: </w:t>
+      </w:r>
+      <w:proofErr w:type="spellStart"/>
+      <w:r>
+        <w:rPr>
+          <w:rFonts w:ascii="Times New Roman" w:hAnsi="Times New Roman" w:cs="Times New Roman"/>
+          <w:b/>
+          <w:bCs/>
+          <w:sz w:val="28"/>
+          <w:szCs w:val="28"/>
+        </w:rPr>
+        <w:t>автотест</w:t>
+      </w:r>
+      <w:proofErr w:type="spellEnd"/>
+      <w:r>
+        <w:rPr>
+          <w:rFonts w:ascii="Times New Roman" w:hAnsi="Times New Roman" w:cs="Times New Roman"/>
+          <w:b/>
+          <w:bCs/>
+          <w:sz w:val="28"/>
+          <w:szCs w:val="28"/>
+        </w:rPr>
+        <w:t xml:space="preserve"> подключения к БД</w:t>
+      </w:r>
+    </w:p>
+    <w:p>
+      <w:pPr>
+        <w:rPr>
+          <w:rFonts w:ascii="Times New Roman" w:hAnsi="Times New Roman" w:cs="Times New Roman"/>
+          <w:sz w:val="28"/>
+          <w:szCs w:val="28"/>
+          <w:lang w:val="en-US"/>
+        </w:rPr>
+      </w:pPr>
+      <w:r>
+        <w:rPr>
+          <w:rFonts w:ascii="Times New Roman" w:hAnsi="Times New Roman" w:cs="Times New Roman"/>
+          <w:b/>
+          <w:bCs/>
+          <w:sz w:val="28"/>
+          <w:szCs w:val="28"/>
+        </w:rPr>
+        <w:t xml:space="preserve">Задание. </w:t>
+      </w:r>
+      <w:r>
+        <w:rPr>
+          <w:rFonts w:ascii="Times New Roman" w:hAnsi="Times New Roman" w:cs="Times New Roman"/>
+          <w:sz w:val="28"/>
+          <w:szCs w:val="28"/>
+        </w:rPr>
+        <w:t xml:space="preserve">Написать на Python </w:t>
+      </w:r>
+      <w:proofErr w:type="spellStart"/>
+      <w:r>
+        <w:rPr>
+          <w:rFonts w:ascii="Times New Roman" w:hAnsi="Times New Roman" w:cs="Times New Roman"/>
+          <w:sz w:val="28"/>
+          <w:szCs w:val="28"/>
+        </w:rPr>
+        <w:t>автотест</w:t>
+      </w:r>
+      <w:proofErr w:type="spellEnd"/>
+      <w:r>
+        <w:rPr>
+          <w:rFonts w:ascii="Times New Roman" w:hAnsi="Times New Roman" w:cs="Times New Roman"/>
+          <w:sz w:val="28"/>
+          <w:szCs w:val="28"/>
+        </w:rPr>
+        <w:t xml:space="preserve"> с использованием </w:t>
+      </w:r>
+      <w:proofErr w:type="spellStart"/>
+      <w:r>
+        <w:rPr>
+          <w:rFonts w:ascii="Times New Roman" w:hAnsi="Times New Roman" w:cs="Times New Roman"/>
+          <w:sz w:val="28"/>
+          <w:szCs w:val="28"/>
+        </w:rPr>
+        <w:t>pytest</w:t>
+      </w:r>
+      <w:proofErr w:type="spellEnd"/>
+      <w:r>
+        <w:rPr>
+          <w:rFonts w:ascii="Times New Roman" w:hAnsi="Times New Roman" w:cs="Times New Roman"/>
+          <w:sz w:val="28"/>
+          <w:szCs w:val="28"/>
+        </w:rPr>
+        <w:t xml:space="preserve">, который проверяет подключение к базе данных и работоспособность простейшего запроса. СУБД: Oracle или Microsoft SQL Server (если с ними проблемы, подойдёт </w:t>
+      </w:r>
+      <w:proofErr w:type="spellStart"/>
+      <w:r>
+        <w:rPr>
+          <w:rFonts w:ascii="Times New Roman" w:hAnsi="Times New Roman" w:cs="Times New Roman"/>
+          <w:sz w:val="28"/>
+          <w:szCs w:val="28"/>
+        </w:rPr>
+        <w:t>PostgreSQL</w:t>
+      </w:r>
+      <w:proofErr w:type="spellEnd"/>
+      <w:r>
+        <w:rPr>
+          <w:rFonts w:ascii="Times New Roman" w:hAnsi="Times New Roman" w:cs="Times New Roman"/>
+          <w:sz w:val="28"/>
+          <w:szCs w:val="28"/>
+        </w:rPr>
+        <w:t xml:space="preserve"> или MySQL).</w:t>
+      </w:r>
+    </w:p>
+    <w:p>
+      <w:pPr>
         <w:jc w:val="both"/>
         <w:rPr>
           <w:rFonts w:ascii="Times New Roman" w:hAnsi="Times New Roman" w:cs="Times New Roman"/>
+          <w:b/>
+          <w:bCs/>
+          <w:sz w:val="28"/>
+          <w:szCs w:val="28"/>
+        </w:rPr>
+      </w:pPr>
+      <w:r>
+        <w:rPr>
+          <w:rFonts w:ascii="Times New Roman" w:hAnsi="Times New Roman" w:cs="Times New Roman"/>
+          <w:b/>
+          <w:bCs/>
+          <w:sz w:val="28"/>
+          <w:szCs w:val="28"/>
+        </w:rPr>
+        <w:t>Реализация:</w:t>
+      </w:r>
+    </w:p>
+    <w:p>
+      <w:pPr>
+        <w:jc w:val="both"/>
+        <w:rPr>
+          <w:rFonts w:ascii="Times New Roman" w:hAnsi="Times New Roman" w:cs="Times New Roman"/>
+          <w:sz w:val="28"/>
+          <w:szCs w:val="28"/>
+        </w:rPr>
+      </w:pPr>
+      <w:r>
+        <w:rPr>
+          <w:rFonts w:ascii="Times New Roman" w:hAnsi="Times New Roman" w:cs="Times New Roman"/>
+          <w:sz w:val="28"/>
+          <w:szCs w:val="28"/>
+        </w:rPr>
+        <w:t xml:space="preserve">Для подключения к </w:t>
+      </w:r>
+      <w:proofErr w:type="spellStart"/>
+      <w:r>
+        <w:rPr>
+          <w:rFonts w:ascii="Times New Roman" w:hAnsi="Times New Roman" w:cs="Times New Roman"/>
+          <w:sz w:val="28"/>
+          <w:szCs w:val="28"/>
+        </w:rPr>
+        <w:t>PostgreSQL</w:t>
+      </w:r>
+      <w:proofErr w:type="spellEnd"/>
+      <w:r>
+        <w:rPr>
+          <w:rFonts w:ascii="Times New Roman" w:hAnsi="Times New Roman" w:cs="Times New Roman"/>
+          <w:sz w:val="28"/>
+          <w:szCs w:val="28"/>
+        </w:rPr>
+        <w:t xml:space="preserve"> использована библиотека </w:t>
+      </w:r>
+      <w:proofErr w:type="spellStart"/>
+      <w:r>
+        <w:rPr>
+          <w:rFonts w:ascii="Times New Roman" w:hAnsi="Times New Roman" w:cs="Times New Roman"/>
+          <w:sz w:val="28"/>
+          <w:szCs w:val="28"/>
+        </w:rPr>
+        <w:t>psycopg</w:t>
+      </w:r>
+      <w:proofErr w:type="spellEnd"/>
+      <w:r>
+        <w:rPr>
+          <w:rFonts w:ascii="Times New Roman" w:hAnsi="Times New Roman" w:cs="Times New Roman"/>
+          <w:sz w:val="28"/>
+          <w:szCs w:val="28"/>
+        </w:rPr>
+        <w:t xml:space="preserve">. Для автоматического запуска проверки используется </w:t>
+      </w:r>
+      <w:proofErr w:type="spellStart"/>
+      <w:r>
+        <w:rPr>
+          <w:rFonts w:ascii="Times New Roman" w:hAnsi="Times New Roman" w:cs="Times New Roman"/>
+          <w:sz w:val="28"/>
+          <w:szCs w:val="28"/>
+        </w:rPr>
+        <w:t>pytest</w:t>
+      </w:r>
+      <w:proofErr w:type="spellEnd"/>
+      <w:r>
+        <w:rPr>
+          <w:rFonts w:ascii="Times New Roman" w:hAnsi="Times New Roman" w:cs="Times New Roman"/>
+          <w:sz w:val="28"/>
+          <w:szCs w:val="28"/>
+        </w:rPr>
+        <w:t>.</w:t>
+      </w:r>
+    </w:p>
+    <w:p>
+      <w:pPr>
+        <w:jc w:val="both"/>
+        <w:rPr>
+          <w:rFonts w:ascii="Times New Roman" w:hAnsi="Times New Roman" w:cs="Times New Roman"/>
+          <w:sz w:val="28"/>
+          <w:szCs w:val="28"/>
+        </w:rPr>
+      </w:pPr>
+      <w:r>
+        <w:rPr>
+          <w:rFonts w:ascii="Times New Roman" w:hAnsi="Times New Roman" w:cs="Times New Roman"/>
+          <w:sz w:val="28"/>
+          <w:szCs w:val="28"/>
+        </w:rPr>
+        <w:t>Тест tests/test_db_connection.py выполняет следующие действия:</w:t>
+      </w:r>
+    </w:p>
+    <w:p>
+      <w:pPr>
+        <w:numPr>
+          <w:ilvl w:val="0"/>
+          <w:numId w:val="14"/>
+        </w:numPr>
+        <w:jc w:val="both"/>
+        <w:rPr>
+          <w:rFonts w:ascii="Times New Roman" w:hAnsi="Times New Roman" w:cs="Times New Roman"/>
+          <w:sz w:val="28"/>
+          <w:szCs w:val="28"/>
+        </w:rPr>
+      </w:pPr>
+      <w:r>
+        <w:rPr>
+          <w:rFonts w:ascii="Times New Roman" w:hAnsi="Times New Roman" w:cs="Times New Roman"/>
+          <w:sz w:val="28"/>
+          <w:szCs w:val="28"/>
+        </w:rPr>
+        <w:lastRenderedPageBreak/>
+        <w:t>Получает параметры подключения к базе данных из переменных окружения.</w:t>
+      </w:r>
+    </w:p>
+    <w:p>
+      <w:pPr>
+        <w:numPr>
+          <w:ilvl w:val="0"/>
+          <w:numId w:val="14"/>
+        </w:numPr>
+        <w:jc w:val="both"/>
+        <w:rPr>
+          <w:rFonts w:ascii="Times New Roman" w:hAnsi="Times New Roman" w:cs="Times New Roman"/>
+          <w:sz w:val="28"/>
+          <w:szCs w:val="28"/>
+        </w:rPr>
+      </w:pPr>
+      <w:r>
+        <w:rPr>
+          <w:rFonts w:ascii="Times New Roman" w:hAnsi="Times New Roman" w:cs="Times New Roman"/>
+          <w:sz w:val="28"/>
+          <w:szCs w:val="28"/>
+        </w:rPr>
+        <w:t xml:space="preserve">Устанавливает соединение с </w:t>
+      </w:r>
+      <w:proofErr w:type="spellStart"/>
+      <w:r>
+        <w:rPr>
+          <w:rFonts w:ascii="Times New Roman" w:hAnsi="Times New Roman" w:cs="Times New Roman"/>
+          <w:sz w:val="28"/>
+          <w:szCs w:val="28"/>
+        </w:rPr>
+        <w:t>PostgreSQL</w:t>
+      </w:r>
+      <w:proofErr w:type="spellEnd"/>
+      <w:r>
+        <w:rPr>
+          <w:rFonts w:ascii="Times New Roman" w:hAnsi="Times New Roman" w:cs="Times New Roman"/>
+          <w:sz w:val="28"/>
+          <w:szCs w:val="28"/>
+        </w:rPr>
+        <w:t>.</w:t>
+      </w:r>
+    </w:p>
+    <w:p>
+      <w:pPr>
+        <w:numPr>
+          <w:ilvl w:val="0"/>
+          <w:numId w:val="14"/>
+        </w:numPr>
+        <w:jc w:val="both"/>
+        <w:rPr>
+          <w:rFonts w:ascii="Times New Roman" w:hAnsi="Times New Roman" w:cs="Times New Roman"/>
+          <w:sz w:val="28"/>
+          <w:szCs w:val="28"/>
+        </w:rPr>
+      </w:pPr>
+      <w:r>
+        <w:rPr>
+          <w:rFonts w:ascii="Times New Roman" w:hAnsi="Times New Roman" w:cs="Times New Roman"/>
+          <w:sz w:val="28"/>
+          <w:szCs w:val="28"/>
+        </w:rPr>
+        <w:t xml:space="preserve">Выполняет запрос SELECT </w:t>
+      </w:r>
+      <w:proofErr w:type="gramStart"/>
+      <w:r>
+        <w:rPr>
+          <w:rFonts w:ascii="Times New Roman" w:hAnsi="Times New Roman" w:cs="Times New Roman"/>
+          <w:sz w:val="28"/>
+          <w:szCs w:val="28"/>
+        </w:rPr>
+        <w:t>NOW(</w:t>
+      </w:r>
+      <w:proofErr w:type="gramEnd"/>
+      <w:r>
+        <w:rPr>
+          <w:rFonts w:ascii="Times New Roman" w:hAnsi="Times New Roman" w:cs="Times New Roman"/>
+          <w:sz w:val="28"/>
+          <w:szCs w:val="28"/>
+        </w:rPr>
+        <w:t>), возвращающий текущие дату и время сервера.</w:t>
+      </w:r>
+    </w:p>
+    <w:p>
+      <w:pPr>
+        <w:numPr>
+          <w:ilvl w:val="0"/>
+          <w:numId w:val="14"/>
+        </w:numPr>
+        <w:jc w:val="both"/>
+        <w:rPr>
+          <w:rFonts w:ascii="Times New Roman" w:hAnsi="Times New Roman" w:cs="Times New Roman"/>
+          <w:sz w:val="28"/>
+          <w:szCs w:val="28"/>
+        </w:rPr>
+      </w:pPr>
+      <w:r>
+        <w:rPr>
+          <w:rFonts w:ascii="Times New Roman" w:hAnsi="Times New Roman" w:cs="Times New Roman"/>
+          <w:sz w:val="28"/>
+          <w:szCs w:val="28"/>
+        </w:rPr>
+        <w:t>Проверяет, что запрос вернул результат и значение не является NULL.</w:t>
+      </w:r>
+    </w:p>
+    <w:p>
+      <w:pPr>
+        <w:numPr>
+          <w:ilvl w:val="0"/>
+          <w:numId w:val="14"/>
+        </w:numPr>
+        <w:jc w:val="both"/>
+        <w:rPr>
+          <w:rFonts w:ascii="Times New Roman" w:hAnsi="Times New Roman" w:cs="Times New Roman"/>
+          <w:sz w:val="28"/>
+          <w:szCs w:val="28"/>
+        </w:rPr>
+      </w:pPr>
+      <w:r>
+        <w:rPr>
+          <w:rFonts w:ascii="Times New Roman" w:hAnsi="Times New Roman" w:cs="Times New Roman"/>
+          <w:sz w:val="28"/>
+          <w:szCs w:val="28"/>
+        </w:rPr>
+        <w:t>Закрывает соединение после завершения проверки.</w:t>
+      </w:r>
+    </w:p>
+    <w:p>
+      <w:pPr>
+        <w:jc w:val="both"/>
+        <w:rPr>
+          <w:rFonts w:ascii="Times New Roman" w:hAnsi="Times New Roman" w:cs="Times New Roman"/>
+          <w:b/>
+          <w:bCs/>
+          <w:sz w:val="28"/>
+          <w:szCs w:val="28"/>
+        </w:rPr>
+      </w:pPr>
+      <w:r>
+        <w:rPr>
+          <w:rFonts w:ascii="Times New Roman" w:hAnsi="Times New Roman" w:cs="Times New Roman"/>
+          <w:b/>
+          <w:bCs/>
+          <w:sz w:val="28"/>
+          <w:szCs w:val="28"/>
+        </w:rPr>
+        <w:t>Проверка работы</w:t>
+      </w:r>
+    </w:p>
+    <w:p>
+      <w:pPr>
+        <w:jc w:val="both"/>
+        <w:rPr>
+          <w:rFonts w:ascii="Times New Roman" w:hAnsi="Times New Roman" w:cs="Times New Roman"/>
+          <w:sz w:val="28"/>
+          <w:szCs w:val="28"/>
+        </w:rPr>
+      </w:pPr>
+      <w:r>
+        <w:rPr>
+          <w:rFonts w:ascii="Times New Roman" w:hAnsi="Times New Roman" w:cs="Times New Roman"/>
+          <w:sz w:val="28"/>
+          <w:szCs w:val="28"/>
+        </w:rPr>
+        <w:t xml:space="preserve">Для проверки использована тестовая база данных </w:t>
+      </w:r>
+      <w:proofErr w:type="spellStart"/>
+      <w:r>
+        <w:rPr>
+          <w:rFonts w:ascii="Times New Roman" w:hAnsi="Times New Roman" w:cs="Times New Roman"/>
+          <w:sz w:val="28"/>
+          <w:szCs w:val="28"/>
+        </w:rPr>
+        <w:t>PostgreSQL</w:t>
+      </w:r>
+      <w:proofErr w:type="spellEnd"/>
+      <w:r>
+        <w:rPr>
+          <w:rFonts w:ascii="Times New Roman" w:hAnsi="Times New Roman" w:cs="Times New Roman"/>
+          <w:sz w:val="28"/>
+          <w:szCs w:val="28"/>
+        </w:rPr>
+        <w:t xml:space="preserve">, запущенная в </w:t>
+      </w:r>
+      <w:proofErr w:type="spellStart"/>
+      <w:r>
+        <w:rPr>
+          <w:rFonts w:ascii="Times New Roman" w:hAnsi="Times New Roman" w:cs="Times New Roman"/>
+          <w:sz w:val="28"/>
+          <w:szCs w:val="28"/>
+        </w:rPr>
+        <w:t>Docker</w:t>
+      </w:r>
+      <w:proofErr w:type="spellEnd"/>
+      <w:r>
+        <w:rPr>
+          <w:rFonts w:ascii="Times New Roman" w:hAnsi="Times New Roman" w:cs="Times New Roman"/>
+          <w:sz w:val="28"/>
+          <w:szCs w:val="28"/>
+        </w:rPr>
+        <w:t>.</w:t>
+      </w:r>
+    </w:p>
+    <w:p>
+      <w:pPr>
+        <w:jc w:val="both"/>
+        <w:rPr>
+          <w:rFonts w:ascii="Times New Roman" w:hAnsi="Times New Roman" w:cs="Times New Roman"/>
+          <w:sz w:val="28"/>
+          <w:szCs w:val="28"/>
+        </w:rPr>
+      </w:pPr>
+      <w:r>
+        <w:rPr>
+          <w:rFonts w:ascii="Times New Roman" w:hAnsi="Times New Roman" w:cs="Times New Roman"/>
+          <w:sz w:val="28"/>
+          <w:szCs w:val="28"/>
+        </w:rPr>
+        <w:t>Команда запуска теста:</w:t>
+      </w:r>
+      <w:r>
+        <w:rPr>
+          <w:rFonts w:ascii="Times New Roman" w:hAnsi="Times New Roman" w:cs="Times New Roman"/>
+          <w:sz w:val="28"/>
+          <w:szCs w:val="28"/>
+        </w:rPr>
+        <w:t xml:space="preserve"> </w:t>
+      </w:r>
+      <w:proofErr w:type="spellStart"/>
+      <w:r>
+        <w:rPr>
+          <w:rFonts w:ascii="Times New Roman" w:hAnsi="Times New Roman" w:cs="Times New Roman"/>
+          <w:sz w:val="28"/>
+          <w:szCs w:val="28"/>
+        </w:rPr>
+        <w:t>python</w:t>
+      </w:r>
+      <w:proofErr w:type="spellEnd"/>
+      <w:r>
+        <w:rPr>
+          <w:rFonts w:ascii="Times New Roman" w:hAnsi="Times New Roman" w:cs="Times New Roman"/>
+          <w:sz w:val="28"/>
+          <w:szCs w:val="28"/>
+        </w:rPr>
+        <w:t xml:space="preserve"> </w:t>
+      </w:r>
+      <w:proofErr w:type="spellStart"/>
+      <w:r>
+        <w:rPr>
+          <w:rFonts w:ascii="Times New Roman" w:hAnsi="Times New Roman" w:cs="Times New Roman"/>
+          <w:sz w:val="28"/>
+          <w:szCs w:val="28"/>
+        </w:rPr>
+        <w:t>pytest</w:t>
+      </w:r>
+      <w:proofErr w:type="spellEnd"/>
+      <w:r>
+        <w:rPr>
+          <w:rFonts w:ascii="Times New Roman" w:hAnsi="Times New Roman" w:cs="Times New Roman"/>
+          <w:sz w:val="28"/>
+          <w:szCs w:val="28"/>
+        </w:rPr>
+        <w:t xml:space="preserve"> -v</w:t>
+      </w:r>
+    </w:p>
+    <w:p>
+      <w:pPr>
+        <w:jc w:val="both"/>
+        <w:rPr>
+          <w:rFonts w:ascii="Times New Roman" w:hAnsi="Times New Roman" w:cs="Times New Roman"/>
+          <w:sz w:val="28"/>
+          <w:szCs w:val="28"/>
+        </w:rPr>
+      </w:pPr>
+      <w:r>
+        <w:rPr>
+          <w:rFonts w:ascii="Times New Roman" w:hAnsi="Times New Roman" w:cs="Times New Roman"/>
+          <w:sz w:val="28"/>
+          <w:szCs w:val="28"/>
+        </w:rPr>
+        <w:t>При корректных параметрах подключения тест завершается успешно (PASSED). Это подтверждает, что Python-приложение может установить соединение с базой данных и выполнить SQL-запрос.</w:t>
+      </w:r>
+    </w:p>
+    <w:p>
+      <w:pPr>
+        <w:jc w:val="both"/>
+        <w:rPr>
+          <w:rFonts w:ascii="Times New Roman" w:hAnsi="Times New Roman" w:cs="Times New Roman"/>
+          <w:sz w:val="28"/>
+          <w:szCs w:val="28"/>
+        </w:rPr>
+      </w:pPr>
+      <w:r>
+        <w:rPr>
+          <w:rFonts w:ascii="Times New Roman" w:hAnsi="Times New Roman" w:cs="Times New Roman"/>
+          <w:sz w:val="28"/>
+          <w:szCs w:val="28"/>
+        </w:rPr>
+        <w:t>Дополнительно проверена обработка ошибки подключения: при указании неверного пароля тест завершается с ошибкой. После восстановления корректных параметров тест снова проходит успешно.</w:t>
+      </w:r>
+    </w:p>
+    <w:p>
+      <w:pPr>
+        <w:jc w:val="both"/>
+        <w:rPr>
+          <w:rFonts w:ascii="Times New Roman" w:hAnsi="Times New Roman" w:cs="Times New Roman"/>
+          <w:b/>
+          <w:bCs/>
+          <w:sz w:val="28"/>
+          <w:szCs w:val="28"/>
+        </w:rPr>
+      </w:pPr>
+      <w:r>
+        <w:rPr>
+          <w:rFonts w:ascii="Times New Roman" w:hAnsi="Times New Roman" w:cs="Times New Roman"/>
+          <w:b/>
+          <w:bCs/>
+          <w:sz w:val="28"/>
+          <w:szCs w:val="28"/>
+        </w:rPr>
+        <w:t>Результат</w:t>
+      </w:r>
+    </w:p>
+    <w:p>
+      <w:pPr>
+        <w:jc w:val="both"/>
+        <w:rPr>
+          <w:rFonts w:ascii="Times New Roman" w:hAnsi="Times New Roman" w:cs="Times New Roman"/>
+          <w:sz w:val="28"/>
+          <w:szCs w:val="28"/>
+        </w:rPr>
+      </w:pPr>
+      <w:r>
+        <w:rPr>
+          <w:rFonts w:ascii="Times New Roman" w:hAnsi="Times New Roman" w:cs="Times New Roman"/>
+          <w:sz w:val="28"/>
+          <w:szCs w:val="28"/>
+        </w:rPr>
+        <w:t xml:space="preserve">Дымовой тест реализован и проверен. Он позволяет быстро убедиться в доступности </w:t>
+      </w:r>
+      <w:proofErr w:type="spellStart"/>
+      <w:r>
+        <w:rPr>
+          <w:rFonts w:ascii="Times New Roman" w:hAnsi="Times New Roman" w:cs="Times New Roman"/>
+          <w:sz w:val="28"/>
+          <w:szCs w:val="28"/>
+        </w:rPr>
+        <w:t>PostgreSQL</w:t>
+      </w:r>
+      <w:proofErr w:type="spellEnd"/>
+      <w:r>
+        <w:rPr>
+          <w:rFonts w:ascii="Times New Roman" w:hAnsi="Times New Roman" w:cs="Times New Roman"/>
+          <w:sz w:val="28"/>
+          <w:szCs w:val="28"/>
+        </w:rPr>
+        <w:t>, корректности параметров подключения и возможности выполнения SQL-запросов из Python.</w:t>
+      </w:r>
+    </w:p>
+    <w:p>
+      <w:pPr>
+        <w:jc w:val="both"/>
+        <w:rPr>
+          <w:rFonts w:ascii="Times New Roman" w:hAnsi="Times New Roman" w:cs="Times New Roman"/>
+          <w:sz w:val="28"/>
+          <w:szCs w:val="28"/>
+        </w:rPr>
+      </w:pPr>
+      <w:r>
+        <w:rPr>
+          <w:rFonts w:ascii="Times New Roman" w:hAnsi="Times New Roman" w:cs="Times New Roman"/>
+          <w:sz w:val="28"/>
+          <w:szCs w:val="28"/>
+        </w:rPr>
+        <w:t>Тест предназначен для проверки базовой работоспособности соединения и не заменяет полноценные интеграционные тесты приложения.</w:t>
+      </w:r>
+    </w:p>
+    <w:p>
+      <w:pPr>
+        <w:jc w:val="both"/>
+        <w:rPr>
+          <w:rFonts w:ascii="Times New Roman" w:hAnsi="Times New Roman" w:cs="Times New Roman"/>
+          <w:b/>
+          <w:bCs/>
+          <w:sz w:val="28"/>
+          <w:szCs w:val="28"/>
+        </w:rPr>
+      </w:pPr>
+      <w:r>
+        <w:rPr>
+          <w:rFonts w:ascii="Times New Roman" w:hAnsi="Times New Roman" w:cs="Times New Roman"/>
+          <w:b/>
+          <w:bCs/>
+          <w:sz w:val="28"/>
+          <w:szCs w:val="28"/>
+        </w:rPr>
+        <w:t>1. Успешное подключение</w:t>
+      </w:r>
+    </w:p>
+    <w:p>
+      <w:pPr>
+        <w:jc w:val="both"/>
+        <w:rPr>
+          <w:rFonts w:ascii="Times New Roman" w:hAnsi="Times New Roman" w:cs="Times New Roman"/>
+          <w:b/>
+          <w:bCs/>
+          <w:sz w:val="28"/>
+          <w:szCs w:val="28"/>
+        </w:rPr>
+      </w:pPr>
+      <w:r>
+        <w:rPr>
+          <w:noProof/>
+        </w:rPr>
+        <w:drawing>
+          <wp:inline distT="0" distB="0" distL="0" distR="0" wp14:anchorId="277B9F2B" wp14:editId="55BA51A7">
+            <wp:extent cx="5940425" cy="657860"/>
+            <wp:effectExtent l="0" t="0" r="3175" b="8890"/>
+            <wp:docPr id="1" name="Рисунок 1"/>
+            <wp:cNvGraphicFramePr>
+              <a:graphicFrameLocks xmlns:a="http://schemas.openxmlformats.org/drawingml/2006/main" noChangeAspect="1"/>
+            </wp:cNvGraphicFramePr>
+            <a:graphic xmlns:a="http://schemas.openxmlformats.org/drawingml/2006/main">
+              <a:graphicData uri="http://schemas.openxmlformats.org/drawingml/2006/picture">
+                <pic:pic xmlns:pic="http://schemas.openxmlformats.org/drawingml/2006/picture">
+                  <pic:nvPicPr>
+                    <pic:cNvPr id="1" name=""/>
+                    <pic:cNvPicPr/>
+                  </pic:nvPicPr>
+                  <pic:blipFill>
+                    <a:blip r:embed="rId5"/>
+                    <a:stretch>
+                      <a:fillRect/>
+                    </a:stretch>
+                  </pic:blipFill>
+                  <pic:spPr>
+                    <a:xfrm>
+                      <a:off x="0" y="0"/>
+                      <a:ext cx="5940425" cy="657860"/>
+                    </a:xfrm>
+                    <a:prstGeom prst="rect">
+                      <a:avLst/>
+                    </a:prstGeom>
+                  </pic:spPr>
+                </pic:pic>
+              </a:graphicData>
+            </a:graphic>
+          </wp:inline>
+        </w:drawing>
+      </w:r>
+    </w:p>
+    <w:p>
+      <w:pPr>
+        <w:jc w:val="both"/>
+        <w:rPr>
+          <w:rFonts w:ascii="Times New Roman" w:hAnsi="Times New Roman" w:cs="Times New Roman"/>
+          <w:b/>
+          <w:bCs/>
+          <w:sz w:val="28"/>
+          <w:szCs w:val="28"/>
+        </w:rPr>
+      </w:pPr>
+      <w:r>
+        <w:rPr>
+          <w:rFonts w:ascii="Times New Roman" w:hAnsi="Times New Roman" w:cs="Times New Roman"/>
+          <w:b/>
+          <w:bCs/>
+          <w:sz w:val="28"/>
+          <w:szCs w:val="28"/>
+        </w:rPr>
+        <w:t>2. Проверка неверного пароля</w:t>
+      </w:r>
+    </w:p>
+    <w:p>
+      <w:pPr>
+        <w:jc w:val="both"/>
+        <w:rPr>
+          <w:rFonts w:ascii="Times New Roman" w:hAnsi="Times New Roman" w:cs="Times New Roman"/>
+          <w:b/>
+          <w:bCs/>
+          <w:sz w:val="28"/>
+          <w:szCs w:val="28"/>
+        </w:rPr>
+      </w:pPr>
+      <w:r>
+        <w:rPr>
+          <w:noProof/>
+        </w:rPr>
+        <w:drawing>
+          <wp:inline distT="0" distB="0" distL="0" distR="0" wp14:anchorId="1AC5648F" wp14:editId="059C7AE8">
+            <wp:extent cx="5940425" cy="695960"/>
+            <wp:effectExtent l="0" t="0" r="3175" b="8890"/>
+            <wp:docPr id="2" name="Рисунок 2"/>
+            <wp:cNvGraphicFramePr>
+              <a:graphicFrameLocks xmlns:a="http://schemas.openxmlformats.org/drawingml/2006/main" noChangeAspect="1"/>
+            </wp:cNvGraphicFramePr>
+            <a:graphic xmlns:a="http://schemas.openxmlformats.org/drawingml/2006/main">
+              <a:graphicData uri="http://schemas.openxmlformats.org/drawingml/2006/picture">
+                <pic:pic xmlns:pic="http://schemas.openxmlformats.org/drawingml/2006/picture">
+                  <pic:nvPicPr>
+                    <pic:cNvPr id="1" name=""/>
+                    <pic:cNvPicPr/>
+                  </pic:nvPicPr>
+                  <pic:blipFill>
+                    <a:blip r:embed="rId6"/>
+                    <a:stretch>
+                      <a:fillRect/>
+                    </a:stretch>
+                  </pic:blipFill>
+                  <pic:spPr>
+                    <a:xfrm>
+                      <a:off x="0" y="0"/>
+                      <a:ext cx="5940425" cy="695960"/>
+                    </a:xfrm>
+                    <a:prstGeom prst="rect">
+                      <a:avLst/>
+                    </a:prstGeom>
+                  </pic:spPr>
+                </pic:pic>
+              </a:graphicData>
+            </a:graphic>
+          </wp:inline>
+        </w:drawing>
+      </w:r>
+    </w:p>
+    <w:p>
+      <w:pPr>
+        <w:jc w:val="both"/>
+        <w:rPr>
+          <w:rFonts w:ascii="Times New Roman" w:hAnsi="Times New Roman" w:cs="Times New Roman"/>
+          <w:b/>
+          <w:bCs/>
+          <w:sz w:val="28"/>
+          <w:szCs w:val="28"/>
+        </w:rPr>
+      </w:pPr>
+      <w:r>
+        <w:rPr>
+          <w:noProof/>
+        </w:rPr>
+        <w:lastRenderedPageBreak/>
+        <w:drawing>
+          <wp:inline distT="0" distB="0" distL="0" distR="0" wp14:anchorId="30DCEDE8" wp14:editId="76F9A3F3">
+            <wp:extent cx="5940425" cy="676275"/>
+            <wp:effectExtent l="0" t="0" r="3175" b="9525"/>
+            <wp:docPr id="3" name="Рисунок 3"/>
+            <wp:cNvGraphicFramePr>
+              <a:graphicFrameLocks xmlns:a="http://schemas.openxmlformats.org/drawingml/2006/main" noChangeAspect="1"/>
+            </wp:cNvGraphicFramePr>
+            <a:graphic xmlns:a="http://schemas.openxmlformats.org/drawingml/2006/main">
+              <a:graphicData uri="http://schemas.openxmlformats.org/drawingml/2006/picture">
+                <pic:pic xmlns:pic="http://schemas.openxmlformats.org/drawingml/2006/picture">
+                  <pic:nvPicPr>
+                    <pic:cNvPr id="1" name=""/>
+                    <pic:cNvPicPr/>
+                  </pic:nvPicPr>
+                  <pic:blipFill>
+                    <a:blip r:embed="rId7"/>
+                    <a:stretch>
+                      <a:fillRect/>
+                    </a:stretch>
+                  </pic:blipFill>
+                  <pic:spPr>
+                    <a:xfrm>
+                      <a:off x="0" y="0"/>
+                      <a:ext cx="5940425" cy="676275"/>
+                    </a:xfrm>
+                    <a:prstGeom prst="rect">
+                      <a:avLst/>
+                    </a:prstGeom>
+                  </pic:spPr>
+                </pic:pic>
+              </a:graphicData>
+            </a:graphic>
+          </wp:inline>
+        </w:drawing>
+      </w:r>
+    </w:p>
+    <w:p>
+      <w:pPr>
+        <w:jc w:val="both"/>
+        <w:rPr>
+          <w:rFonts w:ascii="Times New Roman" w:hAnsi="Times New Roman" w:cs="Times New Roman"/>
+          <w:b/>
+          <w:bCs/>
+          <w:sz w:val="28"/>
+          <w:szCs w:val="28"/>
+        </w:rPr>
+      </w:pPr>
+      <w:r>
+        <w:rPr>
+          <w:rFonts w:ascii="Times New Roman" w:hAnsi="Times New Roman" w:cs="Times New Roman"/>
+          <w:b/>
+          <w:bCs/>
+          <w:sz w:val="28"/>
+          <w:szCs w:val="28"/>
+        </w:rPr>
+        <w:t>Код:</w:t>
+      </w:r>
+    </w:p>
+    <w:p>
+      <w:pPr>
+        <w:rPr>
+          <w:rFonts w:ascii="Times New Roman" w:hAnsi="Times New Roman" w:cs="Times New Roman"/>
+          <w:sz w:val="28"/>
+          <w:szCs w:val="28"/>
+        </w:rPr>
+      </w:pPr>
+      <w:proofErr w:type="spellStart"/>
+      <w:r>
+        <w:rPr>
+          <w:rFonts w:ascii="Times New Roman" w:hAnsi="Times New Roman" w:cs="Times New Roman"/>
+          <w:sz w:val="28"/>
+          <w:szCs w:val="28"/>
+        </w:rPr>
+        <w:t>import</w:t>
+      </w:r>
+      <w:proofErr w:type="spellEnd"/>
+      <w:r>
+        <w:rPr>
+          <w:rFonts w:ascii="Times New Roman" w:hAnsi="Times New Roman" w:cs="Times New Roman"/>
+          <w:sz w:val="28"/>
+          <w:szCs w:val="28"/>
+        </w:rPr>
+        <w:t xml:space="preserve"> </w:t>
+      </w:r>
+      <w:proofErr w:type="spellStart"/>
+      <w:r>
+        <w:rPr>
+          <w:rFonts w:ascii="Times New Roman" w:hAnsi="Times New Roman" w:cs="Times New Roman"/>
+          <w:sz w:val="28"/>
+          <w:szCs w:val="28"/>
+        </w:rPr>
+        <w:t>os</w:t>
+      </w:r>
+      <w:proofErr w:type="spellEnd"/>
+      <w:r>
+        <w:rPr>
+          <w:rFonts w:ascii="Times New Roman" w:hAnsi="Times New Roman" w:cs="Times New Roman"/>
+          <w:sz w:val="28"/>
+          <w:szCs w:val="28"/>
+        </w:rPr>
+        <w:br/>
+      </w:r>
+      <w:proofErr w:type="spellStart"/>
+      <w:r>
+        <w:rPr>
+          <w:rFonts w:ascii="Times New Roman" w:hAnsi="Times New Roman" w:cs="Times New Roman"/>
+          <w:sz w:val="28"/>
+          <w:szCs w:val="28"/>
+        </w:rPr>
+        <w:t>import</w:t>
+      </w:r>
+      <w:proofErr w:type="spellEnd"/>
+      <w:r>
+        <w:rPr>
+          <w:rFonts w:ascii="Times New Roman" w:hAnsi="Times New Roman" w:cs="Times New Roman"/>
+          <w:sz w:val="28"/>
+          <w:szCs w:val="28"/>
+        </w:rPr>
+        <w:t xml:space="preserve"> </w:t>
+      </w:r>
+      <w:proofErr w:type="spellStart"/>
+      <w:r>
+        <w:rPr>
+          <w:rFonts w:ascii="Times New Roman" w:hAnsi="Times New Roman" w:cs="Times New Roman"/>
+          <w:sz w:val="28"/>
+          <w:szCs w:val="28"/>
+        </w:rPr>
+        <w:t>psycopg</w:t>
+      </w:r>
+      <w:proofErr w:type="spellEnd"/>
+    </w:p>
+    <w:p>
+      <w:pPr>
+        <w:rPr>
+          <w:rFonts w:ascii="Times New Roman" w:hAnsi="Times New Roman" w:cs="Times New Roman"/>
+          <w:sz w:val="28"/>
+          <w:szCs w:val="28"/>
+        </w:rPr>
+      </w:pPr>
+      <w:r>
+        <w:rPr>
+          <w:rFonts w:ascii="Times New Roman" w:hAnsi="Times New Roman" w:cs="Times New Roman"/>
+          <w:sz w:val="28"/>
+          <w:szCs w:val="28"/>
+        </w:rPr>
+        <w:br/>
+      </w:r>
+      <w:r>
+        <w:rPr>
+          <w:rFonts w:ascii="Times New Roman" w:hAnsi="Times New Roman" w:cs="Times New Roman"/>
+          <w:sz w:val="28"/>
+          <w:szCs w:val="28"/>
+        </w:rPr>
+        <w:br/>
+      </w:r>
+      <w:proofErr w:type="spellStart"/>
+      <w:r>
+        <w:rPr>
+          <w:rFonts w:ascii="Times New Roman" w:hAnsi="Times New Roman" w:cs="Times New Roman"/>
+          <w:sz w:val="28"/>
+          <w:szCs w:val="28"/>
+        </w:rPr>
+        <w:t>def</w:t>
+      </w:r>
+      <w:proofErr w:type="spellEnd"/>
+      <w:r>
+        <w:rPr>
+          <w:rFonts w:ascii="Times New Roman" w:hAnsi="Times New Roman" w:cs="Times New Roman"/>
+          <w:sz w:val="28"/>
+          <w:szCs w:val="28"/>
+        </w:rPr>
+        <w:t xml:space="preserve"> </w:t>
+      </w:r>
+      <w:proofErr w:type="spellStart"/>
+      <w:r>
+        <w:rPr>
+          <w:rFonts w:ascii="Times New Roman" w:hAnsi="Times New Roman" w:cs="Times New Roman"/>
+          <w:sz w:val="28"/>
+          <w:szCs w:val="28"/>
+        </w:rPr>
+        <w:t>test_db_connection</w:t>
+      </w:r>
+      <w:proofErr w:type="spellEnd"/>
+      <w:r>
+        <w:rPr>
+          <w:rFonts w:ascii="Times New Roman" w:hAnsi="Times New Roman" w:cs="Times New Roman"/>
+          <w:sz w:val="28"/>
+          <w:szCs w:val="28"/>
+        </w:rPr>
+        <w:t>():</w:t>
+      </w:r>
+      <w:r>
+        <w:rPr>
+          <w:rFonts w:ascii="Times New Roman" w:hAnsi="Times New Roman" w:cs="Times New Roman"/>
+          <w:sz w:val="28"/>
+          <w:szCs w:val="28"/>
+        </w:rPr>
+        <w:br/>
+        <w:t xml:space="preserve">    </w:t>
+      </w:r>
+      <w:r>
+        <w:rPr>
+          <w:rFonts w:ascii="Times New Roman" w:hAnsi="Times New Roman" w:cs="Times New Roman"/>
+          <w:i/>
+          <w:iCs/>
+          <w:sz w:val="28"/>
+          <w:szCs w:val="28"/>
+        </w:rPr>
+        <w:t>"""</w:t>
+      </w:r>
+      <w:r>
+        <w:rPr>
+          <w:rFonts w:ascii="Times New Roman" w:hAnsi="Times New Roman" w:cs="Times New Roman"/>
+          <w:i/>
+          <w:iCs/>
+          <w:sz w:val="28"/>
+          <w:szCs w:val="28"/>
+        </w:rPr>
+        <w:br/>
+        <w:t xml:space="preserve">    Подключиться к настроенной базе данных и проверить выполнение запроса SELECT NOW(),</w:t>
+      </w:r>
+      <w:r>
+        <w:rPr>
+          <w:rFonts w:ascii="Times New Roman" w:hAnsi="Times New Roman" w:cs="Times New Roman"/>
+          <w:i/>
+          <w:iCs/>
+          <w:sz w:val="28"/>
+          <w:szCs w:val="28"/>
+        </w:rPr>
+        <w:br/>
+        <w:t xml:space="preserve">    который возвращает текущие дату и время.</w:t>
+      </w:r>
+      <w:r>
+        <w:rPr>
+          <w:rFonts w:ascii="Times New Roman" w:hAnsi="Times New Roman" w:cs="Times New Roman"/>
+          <w:i/>
+          <w:iCs/>
+          <w:sz w:val="28"/>
+          <w:szCs w:val="28"/>
+        </w:rPr>
+        <w:br/>
+        <w:t xml:space="preserve">    </w:t>
+      </w:r>
+      <w:r>
+        <w:rPr>
+          <w:rFonts w:ascii="Times New Roman" w:hAnsi="Times New Roman" w:cs="Times New Roman"/>
+          <w:i/>
+          <w:iCs/>
+          <w:sz w:val="28"/>
+          <w:szCs w:val="28"/>
+          <w:lang w:val="en-US"/>
+        </w:rPr>
+        <w:t>"""</w:t>
+      </w:r>
+      <w:r>
+        <w:rPr>
+          <w:rFonts w:ascii="Times New Roman" w:hAnsi="Times New Roman" w:cs="Times New Roman"/>
+          <w:i/>
+          <w:iCs/>
+          <w:sz w:val="28"/>
+          <w:szCs w:val="28"/>
+          <w:lang w:val="en-US"/>
+        </w:rPr>
+        <w:br/>
+        <w:t xml:space="preserve">    </w:t>
+      </w:r>
+      <w:r>
+        <w:rPr>
+          <w:rFonts w:ascii="Times New Roman" w:hAnsi="Times New Roman" w:cs="Times New Roman"/>
+          <w:sz w:val="28"/>
+          <w:szCs w:val="28"/>
+          <w:lang w:val="en-US"/>
+        </w:rPr>
+        <w:t xml:space="preserve">connection = </w:t>
+      </w:r>
+      <w:proofErr w:type="spellStart"/>
+      <w:r>
+        <w:rPr>
+          <w:rFonts w:ascii="Times New Roman" w:hAnsi="Times New Roman" w:cs="Times New Roman"/>
+          <w:sz w:val="28"/>
+          <w:szCs w:val="28"/>
+          <w:lang w:val="en-US"/>
+        </w:rPr>
+        <w:t>psycopg.connect</w:t>
+      </w:r>
+      <w:proofErr w:type="spellEnd"/>
+      <w:r>
+        <w:rPr>
+          <w:rFonts w:ascii="Times New Roman" w:hAnsi="Times New Roman" w:cs="Times New Roman"/>
+          <w:sz w:val="28"/>
+          <w:szCs w:val="28"/>
+          <w:lang w:val="en-US"/>
+        </w:rPr>
+        <w:t>(</w:t>
+      </w:r>
+      <w:r>
+        <w:rPr>
+          <w:rFonts w:ascii="Times New Roman" w:hAnsi="Times New Roman" w:cs="Times New Roman"/>
+          <w:sz w:val="28"/>
+          <w:szCs w:val="28"/>
+          <w:lang w:val="en-US"/>
+        </w:rPr>
+        <w:br/>
+        <w:t xml:space="preserve">        host=</w:t>
+      </w:r>
+      <w:proofErr w:type="spellStart"/>
+      <w:r>
+        <w:rPr>
+          <w:rFonts w:ascii="Times New Roman" w:hAnsi="Times New Roman" w:cs="Times New Roman"/>
+          <w:sz w:val="28"/>
+          <w:szCs w:val="28"/>
+          <w:lang w:val="en-US"/>
+        </w:rPr>
+        <w:t>os.getenv</w:t>
+      </w:r>
+      <w:proofErr w:type="spellEnd"/>
+      <w:r>
+        <w:rPr>
+          <w:rFonts w:ascii="Times New Roman" w:hAnsi="Times New Roman" w:cs="Times New Roman"/>
+          <w:sz w:val="28"/>
+          <w:szCs w:val="28"/>
+          <w:lang w:val="en-US"/>
+        </w:rPr>
+        <w:t>("DB_HOST", "localhost"),</w:t>
+      </w:r>
+      <w:r>
+        <w:rPr>
+          <w:rFonts w:ascii="Times New Roman" w:hAnsi="Times New Roman" w:cs="Times New Roman"/>
+          <w:sz w:val="28"/>
+          <w:szCs w:val="28"/>
+          <w:lang w:val="en-US"/>
+        </w:rPr>
+        <w:br/>
+        <w:t xml:space="preserve">        port=int(</w:t>
+      </w:r>
+      <w:proofErr w:type="spellStart"/>
+      <w:r>
+        <w:rPr>
+          <w:rFonts w:ascii="Times New Roman" w:hAnsi="Times New Roman" w:cs="Times New Roman"/>
+          <w:sz w:val="28"/>
+          <w:szCs w:val="28"/>
+          <w:lang w:val="en-US"/>
+        </w:rPr>
+        <w:t>os.getenv</w:t>
+      </w:r>
+      <w:proofErr w:type="spellEnd"/>
+      <w:r>
+        <w:rPr>
+          <w:rFonts w:ascii="Times New Roman" w:hAnsi="Times New Roman" w:cs="Times New Roman"/>
+          <w:sz w:val="28"/>
+          <w:szCs w:val="28"/>
+          <w:lang w:val="en-US"/>
+        </w:rPr>
+        <w:t>("DB_PORT", "5433")),</w:t>
+      </w:r>
+      <w:r>
+        <w:rPr>
+          <w:rFonts w:ascii="Times New Roman" w:hAnsi="Times New Roman" w:cs="Times New Roman"/>
+          <w:sz w:val="28"/>
+          <w:szCs w:val="28"/>
+          <w:lang w:val="en-US"/>
+        </w:rPr>
+        <w:br/>
+        <w:t xml:space="preserve">        </w:t>
+      </w:r>
+      <w:proofErr w:type="spellStart"/>
+      <w:r>
+        <w:rPr>
+          <w:rFonts w:ascii="Times New Roman" w:hAnsi="Times New Roman" w:cs="Times New Roman"/>
+          <w:sz w:val="28"/>
+          <w:szCs w:val="28"/>
+          <w:lang w:val="en-US"/>
+        </w:rPr>
+        <w:t>dbname</w:t>
+      </w:r>
+      <w:proofErr w:type="spellEnd"/>
+      <w:r>
+        <w:rPr>
+          <w:rFonts w:ascii="Times New Roman" w:hAnsi="Times New Roman" w:cs="Times New Roman"/>
+          <w:sz w:val="28"/>
+          <w:szCs w:val="28"/>
+          <w:lang w:val="en-US"/>
+        </w:rPr>
+        <w:t>=</w:t>
+      </w:r>
+      <w:proofErr w:type="spellStart"/>
+      <w:r>
+        <w:rPr>
+          <w:rFonts w:ascii="Times New Roman" w:hAnsi="Times New Roman" w:cs="Times New Roman"/>
+          <w:sz w:val="28"/>
+          <w:szCs w:val="28"/>
+          <w:lang w:val="en-US"/>
+        </w:rPr>
+        <w:t>os.getenv</w:t>
+      </w:r>
+      <w:proofErr w:type="spellEnd"/>
+      <w:r>
+        <w:rPr>
+          <w:rFonts w:ascii="Times New Roman" w:hAnsi="Times New Roman" w:cs="Times New Roman"/>
+          <w:sz w:val="28"/>
+          <w:szCs w:val="28"/>
+          <w:lang w:val="en-US"/>
+        </w:rPr>
+        <w:t>("DB_NAME", "</w:t>
+      </w:r>
+      <w:proofErr w:type="spellStart"/>
+      <w:r>
+        <w:rPr>
+          <w:rFonts w:ascii="Times New Roman" w:hAnsi="Times New Roman" w:cs="Times New Roman"/>
+          <w:sz w:val="28"/>
+          <w:szCs w:val="28"/>
+          <w:lang w:val="en-US"/>
+        </w:rPr>
+        <w:t>test_db</w:t>
+      </w:r>
+      <w:proofErr w:type="spellEnd"/>
+      <w:r>
+        <w:rPr>
+          <w:rFonts w:ascii="Times New Roman" w:hAnsi="Times New Roman" w:cs="Times New Roman"/>
+          <w:sz w:val="28"/>
+          <w:szCs w:val="28"/>
+          <w:lang w:val="en-US"/>
+        </w:rPr>
+        <w:t>"),</w:t>
+      </w:r>
+      <w:r>
+        <w:rPr>
+          <w:rFonts w:ascii="Times New Roman" w:hAnsi="Times New Roman" w:cs="Times New Roman"/>
+          <w:sz w:val="28"/>
+          <w:szCs w:val="28"/>
+          <w:lang w:val="en-US"/>
+        </w:rPr>
+        <w:br/>
+        <w:t xml:space="preserve">        user=</w:t>
+      </w:r>
+      <w:proofErr w:type="spellStart"/>
+      <w:r>
+        <w:rPr>
+          <w:rFonts w:ascii="Times New Roman" w:hAnsi="Times New Roman" w:cs="Times New Roman"/>
+          <w:sz w:val="28"/>
+          <w:szCs w:val="28"/>
+          <w:lang w:val="en-US"/>
+        </w:rPr>
+        <w:t>os.getenv</w:t>
+      </w:r>
+      <w:proofErr w:type="spellEnd"/>
+      <w:r>
+        <w:rPr>
+          <w:rFonts w:ascii="Times New Roman" w:hAnsi="Times New Roman" w:cs="Times New Roman"/>
+          <w:sz w:val="28"/>
+          <w:szCs w:val="28"/>
+          <w:lang w:val="en-US"/>
+        </w:rPr>
+        <w:t>("DB_USER", "</w:t>
+      </w:r>
+      <w:proofErr w:type="spellStart"/>
+      <w:r>
+        <w:rPr>
+          <w:rFonts w:ascii="Times New Roman" w:hAnsi="Times New Roman" w:cs="Times New Roman"/>
+          <w:sz w:val="28"/>
+          <w:szCs w:val="28"/>
+          <w:lang w:val="en-US"/>
+        </w:rPr>
+        <w:t>test_user</w:t>
+      </w:r>
+      <w:proofErr w:type="spellEnd"/>
+      <w:r>
+        <w:rPr>
+          <w:rFonts w:ascii="Times New Roman" w:hAnsi="Times New Roman" w:cs="Times New Roman"/>
+          <w:sz w:val="28"/>
+          <w:szCs w:val="28"/>
+          <w:lang w:val="en-US"/>
+        </w:rPr>
+        <w:t>"),</w:t>
+      </w:r>
+      <w:r>
+        <w:rPr>
+          <w:rFonts w:ascii="Times New Roman" w:hAnsi="Times New Roman" w:cs="Times New Roman"/>
+          <w:sz w:val="28"/>
+          <w:szCs w:val="28"/>
+          <w:lang w:val="en-US"/>
+        </w:rPr>
+        <w:br/>
+        <w:t xml:space="preserve">        password=</w:t>
+      </w:r>
+      <w:proofErr w:type="spellStart"/>
+      <w:r>
+        <w:rPr>
+          <w:rFonts w:ascii="Times New Roman" w:hAnsi="Times New Roman" w:cs="Times New Roman"/>
+          <w:sz w:val="28"/>
+          <w:szCs w:val="28"/>
+          <w:lang w:val="en-US"/>
+        </w:rPr>
+        <w:t>os.getenv</w:t>
+      </w:r>
+      <w:proofErr w:type="spellEnd"/>
+      <w:r>
+        <w:rPr>
+          <w:rFonts w:ascii="Times New Roman" w:hAnsi="Times New Roman" w:cs="Times New Roman"/>
+          <w:sz w:val="28"/>
+          <w:szCs w:val="28"/>
+          <w:lang w:val="en-US"/>
+        </w:rPr>
+        <w:t>("DB_PASSWORD", "</w:t>
+      </w:r>
+      <w:proofErr w:type="spellStart"/>
+      <w:r>
+        <w:rPr>
+          <w:rFonts w:ascii="Times New Roman" w:hAnsi="Times New Roman" w:cs="Times New Roman"/>
+          <w:sz w:val="28"/>
+          <w:szCs w:val="28"/>
+          <w:lang w:val="en-US"/>
+        </w:rPr>
+        <w:t>test_password</w:t>
+      </w:r>
+      <w:proofErr w:type="spellEnd"/>
+      <w:r>
+        <w:rPr>
+          <w:rFonts w:ascii="Times New Roman" w:hAnsi="Times New Roman" w:cs="Times New Roman"/>
+          <w:sz w:val="28"/>
+          <w:szCs w:val="28"/>
+          <w:lang w:val="en-US"/>
+        </w:rPr>
+        <w:t>"),</w:t>
+      </w:r>
+      <w:r>
+        <w:rPr>
+          <w:rFonts w:ascii="Times New Roman" w:hAnsi="Times New Roman" w:cs="Times New Roman"/>
+          <w:sz w:val="28"/>
+          <w:szCs w:val="28"/>
+          <w:lang w:val="en-US"/>
+        </w:rPr>
+        <w:br/>
+        <w:t xml:space="preserve">        </w:t>
+      </w:r>
+      <w:proofErr w:type="spellStart"/>
+      <w:r>
+        <w:rPr>
+          <w:rFonts w:ascii="Times New Roman" w:hAnsi="Times New Roman" w:cs="Times New Roman"/>
+          <w:sz w:val="28"/>
+          <w:szCs w:val="28"/>
+          <w:lang w:val="en-US"/>
+        </w:rPr>
+        <w:t>connect_timeout</w:t>
+      </w:r>
+      <w:proofErr w:type="spellEnd"/>
+      <w:r>
+        <w:rPr>
+          <w:rFonts w:ascii="Times New Roman" w:hAnsi="Times New Roman" w:cs="Times New Roman"/>
+          <w:sz w:val="28"/>
+          <w:szCs w:val="28"/>
+          <w:lang w:val="en-US"/>
+        </w:rPr>
+        <w:t>=5,</w:t>
+      </w:r>
+      <w:r>
+        <w:rPr>
+          <w:rFonts w:ascii="Times New Roman" w:hAnsi="Times New Roman" w:cs="Times New Roman"/>
+          <w:sz w:val="28"/>
+          <w:szCs w:val="28"/>
+          <w:lang w:val="en-US"/>
+        </w:rPr>
+        <w:br/>
+        <w:t xml:space="preserve">    )</w:t>
+      </w:r>
+      <w:r>
+        <w:rPr>
+          <w:rFonts w:ascii="Times New Roman" w:hAnsi="Times New Roman" w:cs="Times New Roman"/>
+          <w:sz w:val="28"/>
+          <w:szCs w:val="28"/>
+          <w:lang w:val="en-US"/>
+        </w:rPr>
+        <w:br/>
+      </w:r>
+      <w:r>
+        <w:rPr>
+          <w:rFonts w:ascii="Times New Roman" w:hAnsi="Times New Roman" w:cs="Times New Roman"/>
+          <w:sz w:val="28"/>
+          <w:szCs w:val="28"/>
+          <w:lang w:val="en-US"/>
+        </w:rPr>
+        <w:br/>
+        <w:t xml:space="preserve">    try:</w:t>
+      </w:r>
+      <w:r>
+        <w:rPr>
+          <w:rFonts w:ascii="Times New Roman" w:hAnsi="Times New Roman" w:cs="Times New Roman"/>
+          <w:sz w:val="28"/>
+          <w:szCs w:val="28"/>
+          <w:lang w:val="en-US"/>
+        </w:rPr>
+        <w:br/>
+        <w:t xml:space="preserve">        with </w:t>
+      </w:r>
+      <w:proofErr w:type="spellStart"/>
+      <w:r>
+        <w:rPr>
+          <w:rFonts w:ascii="Times New Roman" w:hAnsi="Times New Roman" w:cs="Times New Roman"/>
+          <w:sz w:val="28"/>
+          <w:szCs w:val="28"/>
+          <w:lang w:val="en-US"/>
+        </w:rPr>
+        <w:t>connection.cursor</w:t>
+      </w:r>
+      <w:proofErr w:type="spellEnd"/>
+      <w:r>
+        <w:rPr>
+          <w:rFonts w:ascii="Times New Roman" w:hAnsi="Times New Roman" w:cs="Times New Roman"/>
+          <w:sz w:val="28"/>
+          <w:szCs w:val="28"/>
+          <w:lang w:val="en-US"/>
+        </w:rPr>
+        <w:t>() as cursor:</w:t>
+      </w:r>
+      <w:r>
+        <w:rPr>
+          <w:rFonts w:ascii="Times New Roman" w:hAnsi="Times New Roman" w:cs="Times New Roman"/>
+          <w:sz w:val="28"/>
+          <w:szCs w:val="28"/>
+          <w:lang w:val="en-US"/>
+        </w:rPr>
+        <w:br/>
+        <w:t xml:space="preserve">            </w:t>
+      </w:r>
+      <w:proofErr w:type="spellStart"/>
+      <w:r>
+        <w:rPr>
+          <w:rFonts w:ascii="Times New Roman" w:hAnsi="Times New Roman" w:cs="Times New Roman"/>
+          <w:sz w:val="28"/>
+          <w:szCs w:val="28"/>
+          <w:lang w:val="en-US"/>
+        </w:rPr>
+        <w:t>cursor.execute</w:t>
+      </w:r>
+      <w:proofErr w:type="spellEnd"/>
+      <w:r>
+        <w:rPr>
+          <w:rFonts w:ascii="Times New Roman" w:hAnsi="Times New Roman" w:cs="Times New Roman"/>
+          <w:sz w:val="28"/>
+          <w:szCs w:val="28"/>
+          <w:lang w:val="en-US"/>
+        </w:rPr>
+        <w:t>("SELECT NOW()")</w:t>
+      </w:r>
+      <w:r>
+        <w:rPr>
+          <w:rFonts w:ascii="Times New Roman" w:hAnsi="Times New Roman" w:cs="Times New Roman"/>
+          <w:sz w:val="28"/>
+          <w:szCs w:val="28"/>
+          <w:lang w:val="en-US"/>
+        </w:rPr>
+        <w:br/>
+        <w:t xml:space="preserve">            row = </w:t>
+      </w:r>
+      <w:proofErr w:type="spellStart"/>
+      <w:r>
+        <w:rPr>
+          <w:rFonts w:ascii="Times New Roman" w:hAnsi="Times New Roman" w:cs="Times New Roman"/>
+          <w:sz w:val="28"/>
+          <w:szCs w:val="28"/>
+          <w:lang w:val="en-US"/>
+        </w:rPr>
+        <w:t>cursor.fetchone</w:t>
+      </w:r>
+      <w:proofErr w:type="spellEnd"/>
+      <w:r>
+        <w:rPr>
+          <w:rFonts w:ascii="Times New Roman" w:hAnsi="Times New Roman" w:cs="Times New Roman"/>
+          <w:sz w:val="28"/>
+          <w:szCs w:val="28"/>
+          <w:lang w:val="en-US"/>
+        </w:rPr>
+        <w:t>()</w:t>
+      </w:r>
+      <w:r>
+        <w:rPr>
+          <w:rFonts w:ascii="Times New Roman" w:hAnsi="Times New Roman" w:cs="Times New Roman"/>
+          <w:sz w:val="28"/>
+          <w:szCs w:val="28"/>
+          <w:lang w:val="en-US"/>
+        </w:rPr>
+        <w:br/>
+      </w:r>
+      <w:r>
+        <w:rPr>
+          <w:rFonts w:ascii="Times New Roman" w:hAnsi="Times New Roman" w:cs="Times New Roman"/>
+          <w:sz w:val="28"/>
+          <w:szCs w:val="28"/>
+          <w:lang w:val="en-US"/>
+        </w:rPr>
+        <w:br/>
+        <w:t xml:space="preserve">        assert row is not None, "SELECT NOW() did not return a row"</w:t>
+      </w:r>
+      <w:r>
+        <w:rPr>
+          <w:rFonts w:ascii="Times New Roman" w:hAnsi="Times New Roman" w:cs="Times New Roman"/>
+          <w:sz w:val="28"/>
+          <w:szCs w:val="28"/>
+          <w:lang w:val="en-US"/>
+        </w:rPr>
+        <w:br/>
+        <w:t xml:space="preserve">        assert row[0] is not None, "SELECT NOW() returned NULL"</w:t>
+      </w:r>
+      <w:r>
+        <w:rPr>
+          <w:rFonts w:ascii="Times New Roman" w:hAnsi="Times New Roman" w:cs="Times New Roman"/>
+          <w:sz w:val="28"/>
+          <w:szCs w:val="28"/>
+          <w:lang w:val="en-US"/>
+        </w:rPr>
+        <w:br/>
+        <w:t xml:space="preserve">    finally:</w:t>
+      </w:r>
+      <w:r>
+        <w:rPr>
+          <w:rFonts w:ascii="Times New Roman" w:hAnsi="Times New Roman" w:cs="Times New Roman"/>
+          <w:sz w:val="28"/>
+          <w:szCs w:val="28"/>
+          <w:lang w:val="en-US"/>
+        </w:rPr>
+        <w:br/>
+        <w:t xml:space="preserve">        </w:t>
+      </w:r>
+      <w:proofErr w:type="spellStart"/>
+      <w:r>
+        <w:rPr>
+          <w:rFonts w:ascii="Times New Roman" w:hAnsi="Times New Roman" w:cs="Times New Roman"/>
+          <w:sz w:val="28"/>
+          <w:szCs w:val="28"/>
+          <w:lang w:val="en-US"/>
+        </w:rPr>
+        <w:t>connection.close</w:t>
+      </w:r>
+      <w:proofErr w:type="spellEnd"/>
+      <w:r>
+        <w:rPr>
+          <w:rFonts w:ascii="Times New Roman" w:hAnsi="Times New Roman" w:cs="Times New Roman"/>
+          <w:sz w:val="28"/>
+          <w:szCs w:val="28"/>
+          <w:lang w:val="en-US"/>
+        </w:rPr>
+        <w:t>()</w:t>
+      </w:r>
+    </w:p>
+    <w:p>
+      <w:pPr>
+        <w:rPr>
+          <w:rFonts w:ascii="Times New Roman" w:hAnsi="Times New Roman" w:cs="Times New Roman"/>
+          <w:b/>
+          <w:bCs/>
           <w:sz w:val="28"/>
           <w:szCs w:val="28"/>
           <w:lang w:val="en-US"/>
@@ -6231,6 +7794,119 @@
         <w:rFonts w:ascii="Wingdings" w:hAnsi="Wingdings" w:hint="default"/>
         <w:sz w:val="20"/>
       </w:rPr>
+    </w:lvl>
+  </w:abstractNum>
+  <w:abstractNum w:abstractNumId="11" w15:restartNumberingAfterBreak="0">
+    <w:nsid w:val="7BCB6247"/>
+    <w:multiLevelType w:val="multilevel"/>
+    <w:tmpl w:val="FBDCEF96"/>
+    <w:lvl w:ilvl="0">
+      <w:start w:val="1"/>
+      <w:numFmt w:val="decimal"/>
+      <w:lvlText w:val="%1."/>
+      <w:lvlJc w:val="left"/>
+      <w:pPr>
+        <w:tabs>
+          <w:tab w:val="num" w:pos="720"/>
+        </w:tabs>
+        <w:ind w:left="720" w:hanging="360"/>
+      </w:pPr>
+    </w:lvl>
+    <w:lvl w:ilvl="1" w:tentative="1">
+      <w:start w:val="1"/>
+      <w:numFmt w:val="decimal"/>
+      <w:lvlText w:val="%2."/>
+      <w:lvlJc w:val="left"/>
+      <w:pPr>
+        <w:tabs>
+          <w:tab w:val="num" w:pos="1440"/>
+        </w:tabs>
+        <w:ind w:left="1440" w:hanging="360"/>
+      </w:pPr>
+    </w:lvl>
+    <w:lvl w:ilvl="2" w:tentative="1">
+      <w:start w:val="1"/>
+      <w:numFmt w:val="decimal"/>
+      <w:lvlText w:val="%3."/>
+      <w:lvlJc w:val="left"/>
+      <w:pPr>
+        <w:tabs>
+          <w:tab w:val="num" w:pos="2160"/>
+        </w:tabs>
+        <w:ind w:left="2160" w:hanging="360"/>
+      </w:pPr>
+    </w:lvl>
+    <w:lvl w:ilvl="3" w:tentative="1">
+      <w:start w:val="1"/>
+      <w:numFmt w:val="decimal"/>
+      <w:lvlText w:val="%4."/>
+      <w:lvlJc w:val="left"/>
+      <w:pPr>
+        <w:tabs>
+          <w:tab w:val="num" w:pos="2880"/>
+        </w:tabs>
+        <w:ind w:left="2880" w:hanging="360"/>
+      </w:pPr>
+    </w:lvl>
+    <w:lvl w:ilvl="4" w:tentative="1">
+      <w:start w:val="1"/>
+      <w:numFmt w:val="decimal"/>
+      <w:lvlText w:val="%5."/>
+      <w:lvlJc w:val="left"/>
+      <w:pPr>
+        <w:tabs>
+          <w:tab w:val="num" w:pos="3600"/>
+        </w:tabs>
+        <w:ind w:left="3600" w:hanging="360"/>
+      </w:pPr>
+    </w:lvl>
+    <w:lvl w:ilvl="5" w:tentative="1">
+      <w:start w:val="1"/>
+      <w:numFmt w:val="decimal"/>
+      <w:lvlText w:val="%6."/>
+      <w:lvlJc w:val="left"/>
+      <w:pPr>
+        <w:tabs>
+          <w:tab w:val="num" w:pos="4320"/>
+        </w:tabs>
+        <w:ind w:left="4320" w:hanging="360"/>
+      </w:pPr>
+    </w:lvl>
+    <w:lvl w:ilvl="6" w:tentative="1">
+      <w:start w:val="1"/>
+      <w:numFmt w:val="decimal"/>
+      <w:lvlText w:val="%7."/>
+      <w:lvlJc w:val="left"/>
+      <w:pPr>
+        <w:tabs>
+          <w:tab w:val="num" w:pos="5040"/>
+        </w:tabs>
+        <w:ind w:left="5040" w:hanging="360"/>
+      </w:pPr>
+    </w:lvl>
+    <w:lvl w:ilvl="7" w:tentative="1">
+      <w:start w:val="1"/>
+      <w:numFmt w:val="decimal"/>
+      <w:lvlText w:val="%8."/>
+      <w:lvlJc w:val="left"/>
+      <w:pPr>
+        <w:tabs>
+          <w:tab w:val="num" w:pos="5760"/>
+        </w:tabs>
+        <w:ind w:left="5760" w:hanging="360"/>
+      </w:pPr>
+    </w:lvl>
+    <w:lvl w:ilvl="8" w:tentative="1">
+      <w:start w:val="1"/>
+      <w:numFmt w:val="decimal"/>
+      <w:lvlText w:val="%9."/>
+      <w:lvlJc w:val="left"/>
+      <w:pPr>
+        <w:tabs>
+          <w:tab w:val="num" w:pos="6480"/>
+        </w:tabs>
+        <w:ind w:left="6480" w:hanging="360"/>
+      </w:pPr>
     </w:lvl>
   </w:abstractNum>
   <w:num w:numId="1" w16cid:durableId="19362421">
@@ -6299,6 +7975,9 @@
   </w:num>
   <w:num w:numId="13" w16cid:durableId="836964627">
     <w:abstractNumId w:val="4"/>
+  </w:num>
+  <w:num w:numId="14" w16cid:durableId="60910009">
+    <w:abstractNumId w:val="11"/>
   </w:num>
 </w:numbering>
 </file>
@@ -6732,7 +8411,6 @@
     <w:next w:val="a"/>
     <w:link w:val="20"/>
     <w:uiPriority w:val="9"/>
-    <w:semiHidden/>
     <w:unhideWhenUsed/>
     <w:qFormat/>
     <w:rsid w:val="002E6BBE"/>
@@ -6948,7 +8626,6 @@
     <w:basedOn w:val="a0"/>
     <w:link w:val="2"/>
     <w:uiPriority w:val="9"/>
-    <w:semiHidden/>
     <w:rsid w:val="002E6BBE"/>
     <w:rPr>
       <w:rFonts w:asciiTheme="majorHAnsi" w:eastAsiaTheme="majorEastAsia" w:hAnsiTheme="majorHAnsi" w:cstheme="majorBidi"/>
@@ -7229,6 +8906,36 @@
     <w:rsid w:val="00DC5360"/>
     <w:rPr>
       <w:rFonts w:ascii="Times New Roman" w:hAnsi="Times New Roman" w:cs="Times New Roman"/>
+    </w:rPr>
+  </w:style>
+  <w:style w:type="paragraph" w:styleId="HTML">
+    <w:name w:val="HTML Preformatted"/>
+    <w:basedOn w:val="a"/>
+    <w:link w:val="HTML0"/>
+    <w:uiPriority w:val="99"/>
+    <w:semiHidden/>
+    <w:unhideWhenUsed/>
+    <w:rsid w:val="007C0A7C"/>
+    <w:pPr>
+      <w:spacing w:after="0" w:line="240" w:lineRule="auto"/>
+    </w:pPr>
+    <w:rPr>
+      <w:rFonts w:ascii="Consolas" w:hAnsi="Consolas"/>
+      <w:sz w:val="20"/>
+      <w:szCs w:val="20"/>
+    </w:rPr>
+  </w:style>
+  <w:style w:type="character" w:customStyle="1" w:styleId="HTML0">
+    <w:name w:val="Стандартный HTML Знак"/>
+    <w:basedOn w:val="a0"/>
+    <w:link w:val="HTML"/>
+    <w:uiPriority w:val="99"/>
+    <w:semiHidden/>
+    <w:rsid w:val="007C0A7C"/>
+    <w:rPr>
+      <w:rFonts w:ascii="Consolas" w:hAnsi="Consolas"/>
+      <w:sz w:val="20"/>
+      <w:szCs w:val="20"/>
     </w:rPr>
   </w:style>
 </w:styles>

</xml_diff>